<commit_message>
Leno: novo gancho Parte 1
Co-Authored-By: Claude Opus 5.5 <noreply@anthropic.com>
Claude-Session: https://claude.ai/code/session_01MJjUEEZrxQDEUifKK2vj9g
</commit_message>
<xml_diff>
--- a/roteiros/leno/Leno_Parte1.docx
+++ b/roteiros/leno/Leno_Parte1.docx
@@ -15,7 +15,7 @@
         <w:rPr>
           <w:color w:val="C00000"/>
         </w:rPr>
-        <w:t>Leno tinha vinte e um anos quando gravou o disco que ia mudar a vida dele. Poucos meses depois, recebeu o aviso de que aquelas fitas seriam apagadas.</w:t>
+        <w:t>Leno era um ídolo da Jovem Guarda quando gravou, ao lado de um Raul Seixas ainda desconhecido, um disco que o Brasil foi proibido de ouvir.</w:t>
       </w:r>
     </w:p>
     <w:p>
@@ -23,7 +23,7 @@
         <w:rPr>
           <w:color w:val="C00000"/>
         </w:rPr>
-        <w:t>O que estava gravado ali incomodou gente muito mais poderosa do que uma gravadora. E o que aconteceu com aquelas fitas, ele só foi descobrir um quarto de século depois.</w:t>
+        <w:t>A ditadura cortou as músicas. A gravadora mandou avisar que as fitas seriam apagadas. E o que aconteceu de verdade com aquelas fitas só veio à tona quando já era tarde demais para ele.</w:t>
       </w:r>
     </w:p>
     <w:p>
@@ -31,7 +31,7 @@
         <w:rPr>
           <w:color w:val="C00000"/>
         </w:rPr>
-        <w:t>Fique até o final… porque o dia em que Leno morreu guarda uma coincidência arrepiante para quem conhece essa história.</w:t>
+        <w:t>Fique até o final… porque o dia em que Leno morreu guarda uma coincidência arrepiante, escondida no próprio nome desse disco.</w:t>
       </w:r>
     </w:p>
     <w:p>

</xml_diff>

<commit_message>
Leno: gancho opção 3
Co-Authored-By: Claude Opus 5.5 <noreply@anthropic.com>
Claude-Session: https://claude.ai/code/session_01MJjUEEZrxQDEUifKK2vj9g
</commit_message>
<xml_diff>
--- a/roteiros/leno/Leno_Parte1.docx
+++ b/roteiros/leno/Leno_Parte1.docx
@@ -15,7 +15,7 @@
         <w:rPr>
           <w:color w:val="C00000"/>
         </w:rPr>
-        <w:t>Leno era um ídolo da Jovem Guarda quando gravou, ao lado de um Raul Seixas ainda desconhecido, um disco que o Brasil foi proibido de ouvir.</w:t>
+        <w:t>Leno era um dos rostos mais famosos do Brasil aos dezessete anos. Morreu aos setenta e três, sem que a maior parte do país soubesse quem ele era.</w:t>
       </w:r>
     </w:p>
     <w:p>
@@ -23,7 +23,7 @@
         <w:rPr>
           <w:color w:val="C00000"/>
         </w:rPr>
-        <w:t>A ditadura cortou as músicas. A gravadora mandou avisar que as fitas seriam apagadas. E o que aconteceu de verdade com aquelas fitas só veio à tona quando já era tarde demais para ele.</w:t>
+        <w:t>O que tirou Leno do topo foi um disco. Um disco que ele foi proibido de lançar.</w:t>
       </w:r>
     </w:p>
     <w:p>
@@ -31,7 +31,7 @@
         <w:rPr>
           <w:color w:val="C00000"/>
         </w:rPr>
-        <w:t>Fique até o final… porque o dia em que Leno morreu guarda uma coincidência arrepiante, escondida no próprio nome desse disco.</w:t>
+        <w:t>Fique até o final… porque o que fizeram com esse disco é uma das histórias mais sombrias da música brasileira.</w:t>
       </w:r>
     </w:p>
     <w:p>

</xml_diff>

<commit_message>
Leno: revisão Parte 1
Co-Authored-By: Claude Opus 5.5 <noreply@anthropic.com>
Claude-Session: https://claude.ai/code/session_01MJjUEEZrxQDEUifKK2vj9g
</commit_message>
<xml_diff>
--- a/roteiros/leno/Leno_Parte1.docx
+++ b/roteiros/leno/Leno_Parte1.docx
@@ -263,7 +263,7 @@
         <w:rPr>
           <w:color w:val="C00000"/>
         </w:rPr>
-        <w:t>Esse nome vai voltar nessa história mais de uma vez. Porque foi Renato Barros quem juntou os dois. E foi a ausência dele, anos depois, que ajudou a separar os dois para sempre.</w:t>
+        <w:t>Esse nome vai voltar nessa história mais de uma vez. Porque foi Renato Barros quem juntou os dois. E foi a falta dele, anos depois, que fez a dupla nunca mais dar certo.</w:t>
       </w:r>
     </w:p>
     <w:p>
@@ -375,7 +375,7 @@
         <w:rPr>
           <w:color w:val="C00000"/>
         </w:rPr>
-        <w:t>Aquele disquinho transformou Leno num ídolo nacional antes dos dezoito anos. Mas, vinte e cinco anos depois, a mesma música que deu tudo a ele ia virar uma espécie de prisão.</w:t>
+        <w:t>Aquele disquinho transformou Leno num ídolo nacional antes dos dezoito anos. Como é que a música que deu tudo a ele acabou virando, com o tempo, uma espécie de prisão?</w:t>
       </w:r>
     </w:p>
     <w:p>
@@ -391,7 +391,7 @@
         <w:rPr>
           <w:color w:val="000000"/>
         </w:rPr>
-        <w:t>As rádios tocavam "Pobre Menina" o dia inteiro. "Devolva-me" virou um dos hinos românticos da época.</w:t>
+        <w:t>As rádios do país inteiro tocavam "Pobre Menina". "Devolva-me" virou um dos hinos românticos da época.</w:t>
       </w:r>
     </w:p>
     <w:p>
@@ -535,14 +535,6 @@
         <w:rPr>
           <w:color w:val="000000"/>
         </w:rPr>
-        <w:t>Leno tinha ido longe demais para continuar sendo metade de alguma coisa.</w:t>
-      </w:r>
-    </w:p>
-    <w:p>
-      <w:r>
-        <w:rPr>
-          <w:color w:val="000000"/>
-        </w:rPr>
         <w:t>Lílian revelou anos depois uma frase que explica muito do que aconteceu em seguida.</w:t>
       </w:r>
     </w:p>
@@ -583,7 +575,7 @@
         <w:rPr>
           <w:color w:val="C00000"/>
         </w:rPr>
-        <w:t>Imagine ter dezoito anos, ser famoso no país inteiro, e sentir que a música que todo mundo aplaude pertence a outra pessoa. Foi esse sentimento que levou Leno a tomar a decisão mais arriscada da vida dele.</w:t>
+        <w:t>Imagine ter dezoito anos, ser famoso no país inteiro, e sentir que a música que todo mundo aplaude foi escolhida por outras pessoas. Foi esse sentimento que levou Leno a tomar a decisão mais arriscada da vida dele.</w:t>
       </w:r>
     </w:p>
     <w:p>
@@ -623,7 +615,7 @@
         <w:rPr>
           <w:color w:val="C00000"/>
         </w:rPr>
-        <w:t>Um boato que culpava a pessoa errada pelo fim da dupla. E que escondeu, por muito tempo, o que Leno estava planejando fazer sozinho.</w:t>
+        <w:t>Um boato que culpava a pessoa errada pelo fim da dupla. Enquanto isso, Leno preparava sozinho um plano que ia colocar ele contra a própria gravadora. E contra um governo que não aceitava ouvir certas palavras numa canção.</w:t>
       </w:r>
     </w:p>
     <w:sectPr>

</xml_diff>